<commit_message>
added sridhar repository reference
</commit_message>
<xml_diff>
--- a/doc/Team_Work_Allocation_Ecommerce_MVP.docx
+++ b/doc/Team_Work_Allocation_Ecommerce_MVP.docx
@@ -2075,13 +2075,7 @@
         <w:rPr>
           <w:lang w:val="en-SG"/>
         </w:rPr>
-        <w:t>A</w:t>
-      </w:r>
-      <w:r>
-        <w:rPr>
-          <w:lang w:val="en-SG"/>
-        </w:rPr>
-        <w:t>uthentication</w:t>
+        <w:t>Authentication</w:t>
       </w:r>
     </w:p>
     <w:p>
@@ -2110,13 +2104,7 @@
         <w:rPr>
           <w:lang w:val="en-SG"/>
         </w:rPr>
-        <w:t>P</w:t>
-      </w:r>
-      <w:r>
-        <w:rPr>
-          <w:lang w:val="en-SG"/>
-        </w:rPr>
-        <w:t>roducts</w:t>
+        <w:t>Products</w:t>
       </w:r>
     </w:p>
     <w:p>
@@ -2145,13 +2133,7 @@
         <w:rPr>
           <w:lang w:val="en-SG"/>
         </w:rPr>
-        <w:t>C</w:t>
-      </w:r>
-      <w:r>
-        <w:rPr>
-          <w:lang w:val="en-SG"/>
-        </w:rPr>
-        <w:t>art</w:t>
+        <w:t>Cart</w:t>
       </w:r>
     </w:p>
     <w:p>
@@ -5203,6 +5185,7 @@
   <w:style w:type="character" w:default="1" w:styleId="DefaultParagraphFont">
     <w:name w:val="Default Paragraph Font"/>
     <w:uiPriority w:val="1"/>
+    <w:semiHidden/>
     <w:unhideWhenUsed/>
   </w:style>
   <w:style w:type="table" w:default="1" w:styleId="TableNormal">

</xml_diff>

<commit_message>
updated to ref file
</commit_message>
<xml_diff>
--- a/doc/Team_Work_Allocation_Ecommerce_MVP.docx
+++ b/doc/Team_Work_Allocation_Ecommerce_MVP.docx
@@ -6,26 +6,13 @@
       <w:pPr>
         <w:pStyle w:val="Heading1"/>
       </w:pPr>
-      <w:proofErr w:type="gramStart"/>
       <w:r>
-        <w:t>Team Work</w:t>
-      </w:r>
-      <w:proofErr w:type="gramEnd"/>
-      <w:r>
-        <w:t xml:space="preserve"> Allocation - E-Commerce Web Application (MVP)</w:t>
+        <w:t>Team Work Allocation - E-Commerce Web Application (MVP)</w:t>
       </w:r>
     </w:p>
     <w:p>
       <w:r>
-        <w:t xml:space="preserve">Recommended </w:t>
-      </w:r>
-      <w:proofErr w:type="gramStart"/>
-      <w:r>
-        <w:t>Team Work</w:t>
-      </w:r>
-      <w:proofErr w:type="gramEnd"/>
-      <w:r>
-        <w:t xml:space="preserve"> Allocation</w:t>
+        <w:t>Recommended Team Work Allocation</w:t>
       </w:r>
       <w:r>
         <w:br/>
@@ -153,15 +140,7 @@
               <w:t>Member 2</w:t>
             </w:r>
             <w:r>
-              <w:t xml:space="preserve"> (</w:t>
-            </w:r>
-            <w:proofErr w:type="spellStart"/>
-            <w:r>
-              <w:t>YingTong</w:t>
-            </w:r>
-            <w:proofErr w:type="spellEnd"/>
-            <w:r>
-              <w:t>)</w:t>
+              <w:t xml:space="preserve"> (YingTong)</w:t>
             </w:r>
           </w:p>
         </w:tc>
@@ -1859,21 +1838,7 @@
         <w:rPr>
           <w:lang w:val="en-SG"/>
         </w:rPr>
-        <w:t>origin/</w:t>
-      </w:r>
-      <w:proofErr w:type="spellStart"/>
-      <w:r>
-        <w:rPr>
-          <w:lang w:val="en-SG"/>
-        </w:rPr>
-        <w:t>yingtong</w:t>
-      </w:r>
-      <w:proofErr w:type="spellEnd"/>
-      <w:r>
-        <w:rPr>
-          <w:lang w:val="en-SG"/>
-        </w:rPr>
-        <w:t>-products</w:t>
+        <w:t>origin/yingtong-products</w:t>
       </w:r>
     </w:p>
     <w:p>
@@ -1929,14 +1894,7 @@
         <w:rPr>
           <w:lang w:val="en-SG"/>
         </w:rPr>
-        <w:t xml:space="preserve"> </w:t>
-      </w:r>
-      <w:proofErr w:type="gramStart"/>
-      <w:r>
-        <w:rPr>
-          <w:lang w:val="en-SG"/>
-        </w:rPr>
-        <w:t xml:space="preserve">main </w:t>
+        <w:t xml:space="preserve"> main </w:t>
       </w:r>
       <w:r>
         <w:rPr>
@@ -1944,16 +1902,7 @@
           <w:iCs/>
           <w:lang w:val="en-SG"/>
         </w:rPr>
-        <w:t xml:space="preserve"> (</w:t>
-      </w:r>
-      <w:proofErr w:type="gramEnd"/>
-      <w:r>
-        <w:rPr>
-          <w:i/>
-          <w:iCs/>
-          <w:lang w:val="en-SG"/>
-        </w:rPr>
-        <w:t>protected with rules)</w:t>
+        <w:t xml:space="preserve"> (protected with rules)</w:t>
       </w:r>
     </w:p>
     <w:p>
@@ -2013,11 +1962,9 @@
       </w:r>
     </w:p>
     <w:p>
-      <w:proofErr w:type="spellStart"/>
       <w:r>
         <w:t>MarioMart</w:t>
       </w:r>
-      <w:proofErr w:type="spellEnd"/>
     </w:p>
     <w:p>
       <w:pPr>
@@ -2033,7 +1980,10 @@
       </w:pPr>
       <w:r>
         <w:tab/>
-        <w:t>Document files</w:t>
+        <w:t>Document file</w:t>
+      </w:r>
+      <w:r>
+        <w:t>s</w:t>
       </w:r>
     </w:p>
     <w:p>
@@ -2110,14 +2060,7 @@
       </w:r>
       <w:r>
         <w:tab/>
-      </w:r>
-      <w:proofErr w:type="spellStart"/>
-      <w:r>
-        <w:t>Css</w:t>
-      </w:r>
-      <w:proofErr w:type="spellEnd"/>
-      <w:r>
-        <w:t xml:space="preserve"> files</w:t>
+        <w:t>Css files</w:t>
       </w:r>
     </w:p>
     <w:p>
@@ -2401,14 +2344,12 @@
                 <w:lang w:val="en-SG"/>
               </w:rPr>
             </w:pPr>
-            <w:proofErr w:type="spellStart"/>
             <w:r>
               <w:rPr>
                 <w:lang w:val="en-SG"/>
               </w:rPr>
               <w:t>cart_id</w:t>
             </w:r>
-            <w:proofErr w:type="spellEnd"/>
           </w:p>
         </w:tc>
         <w:tc>
@@ -2489,14 +2430,12 @@
                 <w:lang w:val="en-SG"/>
               </w:rPr>
             </w:pPr>
-            <w:proofErr w:type="spellStart"/>
             <w:r>
               <w:rPr>
                 <w:lang w:val="en-SG"/>
               </w:rPr>
               <w:t>user_id</w:t>
             </w:r>
-            <w:proofErr w:type="spellEnd"/>
           </w:p>
         </w:tc>
         <w:tc>
@@ -2537,16 +2476,8 @@
               <w:rPr>
                 <w:lang w:val="en-SG"/>
               </w:rPr>
-              <w:t xml:space="preserve">FK → </w:t>
+              <w:t>FK → users.user_id</w:t>
             </w:r>
-            <w:proofErr w:type="spellStart"/>
-            <w:r>
-              <w:rPr>
-                <w:lang w:val="en-SG"/>
-              </w:rPr>
-              <w:t>users.user_id</w:t>
-            </w:r>
-            <w:proofErr w:type="spellEnd"/>
           </w:p>
         </w:tc>
         <w:tc>
@@ -2585,14 +2516,12 @@
                 <w:lang w:val="en-SG"/>
               </w:rPr>
             </w:pPr>
-            <w:proofErr w:type="spellStart"/>
             <w:r>
               <w:rPr>
                 <w:lang w:val="en-SG"/>
               </w:rPr>
               <w:t>product_id</w:t>
             </w:r>
-            <w:proofErr w:type="spellEnd"/>
           </w:p>
         </w:tc>
         <w:tc>
@@ -2633,24 +2562,8 @@
               <w:rPr>
                 <w:lang w:val="en-SG"/>
               </w:rPr>
-              <w:t xml:space="preserve">FK → </w:t>
+              <w:t>FK → products.product_id</w:t>
             </w:r>
-            <w:proofErr w:type="spellStart"/>
-            <w:proofErr w:type="gramStart"/>
-            <w:r>
-              <w:rPr>
-                <w:lang w:val="en-SG"/>
-              </w:rPr>
-              <w:t>products.product</w:t>
-            </w:r>
-            <w:proofErr w:type="gramEnd"/>
-            <w:r>
-              <w:rPr>
-                <w:lang w:val="en-SG"/>
-              </w:rPr>
-              <w:t>_id</w:t>
-            </w:r>
-            <w:proofErr w:type="spellEnd"/>
           </w:p>
         </w:tc>
         <w:tc>
@@ -2775,14 +2688,12 @@
                 <w:lang w:val="en-SG"/>
               </w:rPr>
             </w:pPr>
-            <w:proofErr w:type="spellStart"/>
             <w:r>
               <w:rPr>
                 <w:lang w:val="en-SG"/>
               </w:rPr>
               <w:t>created_at</w:t>
             </w:r>
-            <w:proofErr w:type="spellEnd"/>
           </w:p>
         </w:tc>
         <w:tc>
@@ -2863,14 +2774,12 @@
                 <w:lang w:val="en-SG"/>
               </w:rPr>
             </w:pPr>
-            <w:proofErr w:type="spellStart"/>
             <w:r>
               <w:rPr>
                 <w:lang w:val="en-SG"/>
               </w:rPr>
               <w:t>updated_at</w:t>
             </w:r>
-            <w:proofErr w:type="spellEnd"/>
           </w:p>
         </w:tc>
         <w:tc>
@@ -3090,14 +2999,12 @@
                 <w:lang w:val="en-SG"/>
               </w:rPr>
             </w:pPr>
-            <w:proofErr w:type="spellStart"/>
             <w:r>
               <w:rPr>
                 <w:lang w:val="en-SG"/>
               </w:rPr>
               <w:t>order_id</w:t>
             </w:r>
-            <w:proofErr w:type="spellEnd"/>
           </w:p>
         </w:tc>
         <w:tc>
@@ -3178,14 +3085,12 @@
                 <w:lang w:val="en-SG"/>
               </w:rPr>
             </w:pPr>
-            <w:proofErr w:type="spellStart"/>
             <w:r>
               <w:rPr>
                 <w:lang w:val="en-SG"/>
               </w:rPr>
               <w:t>user_id</w:t>
             </w:r>
-            <w:proofErr w:type="spellEnd"/>
           </w:p>
         </w:tc>
         <w:tc>
@@ -3226,16 +3131,8 @@
               <w:rPr>
                 <w:lang w:val="en-SG"/>
               </w:rPr>
-              <w:t xml:space="preserve">FK → </w:t>
+              <w:t>FK → users.user_id</w:t>
             </w:r>
-            <w:proofErr w:type="spellStart"/>
-            <w:r>
-              <w:rPr>
-                <w:lang w:val="en-SG"/>
-              </w:rPr>
-              <w:t>users.user_id</w:t>
-            </w:r>
-            <w:proofErr w:type="spellEnd"/>
           </w:p>
         </w:tc>
         <w:tc>
@@ -3274,14 +3171,12 @@
                 <w:lang w:val="en-SG"/>
               </w:rPr>
             </w:pPr>
-            <w:proofErr w:type="spellStart"/>
             <w:r>
               <w:rPr>
                 <w:lang w:val="en-SG"/>
               </w:rPr>
               <w:t>total_amount</w:t>
             </w:r>
-            <w:proofErr w:type="spellEnd"/>
           </w:p>
         </w:tc>
         <w:tc>
@@ -3297,19 +3192,11 @@
                 <w:lang w:val="en-SG"/>
               </w:rPr>
             </w:pPr>
-            <w:proofErr w:type="gramStart"/>
             <w:r>
               <w:rPr>
                 <w:lang w:val="en-SG"/>
               </w:rPr>
-              <w:t>DECIMAL(</w:t>
-            </w:r>
-            <w:proofErr w:type="gramEnd"/>
-            <w:r>
-              <w:rPr>
-                <w:lang w:val="en-SG"/>
-              </w:rPr>
-              <w:t>10,2)</w:t>
+              <w:t>DECIMAL(10,2)</w:t>
             </w:r>
           </w:p>
         </w:tc>
@@ -3391,19 +3278,11 @@
                 <w:lang w:val="en-SG"/>
               </w:rPr>
             </w:pPr>
-            <w:proofErr w:type="gramStart"/>
             <w:r>
               <w:rPr>
                 <w:lang w:val="en-SG"/>
               </w:rPr>
-              <w:t>VARCHAR(</w:t>
-            </w:r>
-            <w:proofErr w:type="gramEnd"/>
-            <w:r>
-              <w:rPr>
-                <w:lang w:val="en-SG"/>
-              </w:rPr>
-              <w:t>20)</w:t>
+              <w:t>VARCHAR(20)</w:t>
             </w:r>
           </w:p>
         </w:tc>
@@ -3464,14 +3343,12 @@
                 <w:lang w:val="en-SG"/>
               </w:rPr>
             </w:pPr>
-            <w:proofErr w:type="spellStart"/>
             <w:r>
               <w:rPr>
                 <w:lang w:val="en-SG"/>
               </w:rPr>
               <w:t>order_date</w:t>
             </w:r>
-            <w:proofErr w:type="spellEnd"/>
           </w:p>
         </w:tc>
         <w:tc>
@@ -3709,14 +3586,12 @@
                 <w:lang w:val="en-SG"/>
               </w:rPr>
             </w:pPr>
-            <w:proofErr w:type="spellStart"/>
             <w:r>
               <w:rPr>
                 <w:lang w:val="en-SG"/>
               </w:rPr>
               <w:t>order_item_id</w:t>
             </w:r>
-            <w:proofErr w:type="spellEnd"/>
           </w:p>
         </w:tc>
         <w:tc>
@@ -3797,14 +3672,12 @@
                 <w:lang w:val="en-SG"/>
               </w:rPr>
             </w:pPr>
-            <w:proofErr w:type="spellStart"/>
             <w:r>
               <w:rPr>
                 <w:lang w:val="en-SG"/>
               </w:rPr>
               <w:t>order_id</w:t>
             </w:r>
-            <w:proofErr w:type="spellEnd"/>
           </w:p>
         </w:tc>
         <w:tc>
@@ -3845,24 +3718,8 @@
               <w:rPr>
                 <w:lang w:val="en-SG"/>
               </w:rPr>
-              <w:t xml:space="preserve">FK → </w:t>
+              <w:t>FK → orders.order_id</w:t>
             </w:r>
-            <w:proofErr w:type="spellStart"/>
-            <w:proofErr w:type="gramStart"/>
-            <w:r>
-              <w:rPr>
-                <w:lang w:val="en-SG"/>
-              </w:rPr>
-              <w:t>orders.order</w:t>
-            </w:r>
-            <w:proofErr w:type="gramEnd"/>
-            <w:r>
-              <w:rPr>
-                <w:lang w:val="en-SG"/>
-              </w:rPr>
-              <w:t>_id</w:t>
-            </w:r>
-            <w:proofErr w:type="spellEnd"/>
           </w:p>
         </w:tc>
         <w:tc>
@@ -3901,14 +3758,12 @@
                 <w:lang w:val="en-SG"/>
               </w:rPr>
             </w:pPr>
-            <w:proofErr w:type="spellStart"/>
             <w:r>
               <w:rPr>
                 <w:lang w:val="en-SG"/>
               </w:rPr>
               <w:t>product_id</w:t>
             </w:r>
-            <w:proofErr w:type="spellEnd"/>
           </w:p>
         </w:tc>
         <w:tc>
@@ -3949,24 +3804,8 @@
               <w:rPr>
                 <w:lang w:val="en-SG"/>
               </w:rPr>
-              <w:t xml:space="preserve">FK → </w:t>
+              <w:t>FK → products.product_id</w:t>
             </w:r>
-            <w:proofErr w:type="spellStart"/>
-            <w:proofErr w:type="gramStart"/>
-            <w:r>
-              <w:rPr>
-                <w:lang w:val="en-SG"/>
-              </w:rPr>
-              <w:t>products.product</w:t>
-            </w:r>
-            <w:proofErr w:type="gramEnd"/>
-            <w:r>
-              <w:rPr>
-                <w:lang w:val="en-SG"/>
-              </w:rPr>
-              <w:t>_id</w:t>
-            </w:r>
-            <w:proofErr w:type="spellEnd"/>
           </w:p>
         </w:tc>
         <w:tc>
@@ -4112,19 +3951,11 @@
                 <w:lang w:val="en-SG"/>
               </w:rPr>
             </w:pPr>
-            <w:proofErr w:type="gramStart"/>
             <w:r>
               <w:rPr>
                 <w:lang w:val="en-SG"/>
               </w:rPr>
-              <w:t>DECIMAL(</w:t>
-            </w:r>
-            <w:proofErr w:type="gramEnd"/>
-            <w:r>
-              <w:rPr>
-                <w:lang w:val="en-SG"/>
-              </w:rPr>
-              <w:t>10,2)</w:t>
+              <w:t>DECIMAL(10,2)</w:t>
             </w:r>
           </w:p>
         </w:tc>
@@ -4206,19 +4037,11 @@
                 <w:lang w:val="en-SG"/>
               </w:rPr>
             </w:pPr>
-            <w:proofErr w:type="gramStart"/>
             <w:r>
               <w:rPr>
                 <w:lang w:val="en-SG"/>
               </w:rPr>
-              <w:t>DECIMAL(</w:t>
-            </w:r>
-            <w:proofErr w:type="gramEnd"/>
-            <w:r>
-              <w:rPr>
-                <w:lang w:val="en-SG"/>
-              </w:rPr>
-              <w:t>10,2)</w:t>
+              <w:t>DECIMAL(10,2)</w:t>
             </w:r>
           </w:p>
         </w:tc>

</xml_diff>